<commit_message>
Projeto de lei: eleva multas, agrava reincidência e cria redução na primeira infração
Co-Authored-By: Claude Opus 5.5 <noreply@anthropic.com>
Claude-Session: https://claude.ai/code/session_01QxQgFxgAejPtwbJsgdYcvs
</commit_message>
<xml_diff>
--- a/Miguel Alves - Animais soltos em vias/Projeto de Lei de Iniciativa Popular e Exposição de Motivos.docx
+++ b/Miguel Alves - Animais soltos em vias/Projeto de Lei de Iniciativa Popular e Exposição de Motivos.docx
@@ -757,17 +757,17 @@
         <w:jc w:val="both"/>
       </w:pPr>
       <w:r>
-        <w:t xml:space="preserve">I – animal de médio porte: 15 (quinze) UFIR;</w:t>
-      </w:r>
-    </w:p>
-    <w:p>
-      <w:pPr>
-        <w:spacing w:after="100" w:line="360"/>
-        <w:ind w:left="709"/>
-        <w:jc w:val="both"/>
-      </w:pPr>
-      <w:r>
-        <w:t xml:space="preserve">II – animal de grande porte: 30 (trinta) UFIR.</w:t>
+        <w:t xml:space="preserve">I – animal de médio porte: 30 (trinta) UFIR;</w:t>
+      </w:r>
+    </w:p>
+    <w:p>
+      <w:pPr>
+        <w:spacing w:after="100" w:line="360"/>
+        <w:ind w:left="709"/>
+        <w:jc w:val="both"/>
+      </w:pPr>
+      <w:r>
+        <w:t xml:space="preserve">II – animal de grande porte: 60 (sessenta) UFIR.</w:t>
       </w:r>
     </w:p>
     <w:p>
@@ -784,7 +784,7 @@
         <w:t xml:space="preserve">§ 1º </w:t>
       </w:r>
       <w:r>
-        <w:t xml:space="preserve">Na primeira reincidência, a multa será aplicada em dobro e, a partir da segunda reincidência, em triplo.</w:t>
+        <w:t xml:space="preserve">Na primeira reincidência, a multa será aplicada em triplo e, a partir da segunda reincidência, em quíntuplo.</w:t>
       </w:r>
     </w:p>
     <w:p>
@@ -819,6 +819,40 @@
       </w:r>
       <w:r>
         <w:t xml:space="preserve">A multa independe da apreensão e poderá ser aplicada ainda que o animal não seja recolhido, desde que o responsável seja identificado.</w:t>
+      </w:r>
+    </w:p>
+    <w:p>
+      <w:pPr>
+        <w:spacing w:after="140" w:line="360"/>
+        <w:ind w:firstLine="709"/>
+        <w:jc w:val="both"/>
+      </w:pPr>
+      <w:r>
+        <w:rPr>
+          <w:b/>
+          <w:bCs/>
+        </w:rPr>
+        <w:t xml:space="preserve">§ 4º </w:t>
+      </w:r>
+      <w:r>
+        <w:t xml:space="preserve">Na primeira infração, a multa será reduzida em 50% (cinquenta por cento) se o responsável efetuar o pagamento no prazo de 15 (quinze) dias, contados da notificação, e firmar o termo de compromisso previsto no art. 10, IV, desta Lei, vedada a redução em caso de reincidência ou de acidente de trânsito.</w:t>
+      </w:r>
+    </w:p>
+    <w:p>
+      <w:pPr>
+        <w:spacing w:after="140" w:line="360"/>
+        <w:ind w:firstLine="709"/>
+        <w:jc w:val="both"/>
+      </w:pPr>
+      <w:r>
+        <w:rPr>
+          <w:b/>
+          <w:bCs/>
+        </w:rPr>
+        <w:t xml:space="preserve">§ 5º </w:t>
+      </w:r>
+      <w:r>
+        <w:t xml:space="preserve">A partir da segunda reincidência, a liberação do animal apreendido ficará condicionada, além do disposto no art. 10, à comprovação, mediante vistoria do órgão municipal competente, da adequação das cercas, porteiras ou instalações destinadas à contenção dos animais.</w:t>
       </w:r>
     </w:p>
     <w:p>
@@ -1298,7 +1332,17 @@
         <w:jc w:val="both"/>
       </w:pPr>
       <w:r>
-        <w:t xml:space="preserve">O projeto (i) proíbe a permanência de animais de médio e grande porte soltos em vias, logradouros e estradas municipais; (ii) estabelece os deveres do responsável; (iii) disciplina a apreensão, o registro, o bem-estar do animal, a notificação, o prazo de resgate e a destinação por leilão ou doação, vedada a eliminação sem justificativa sanitária; (iv) prevê multa proporcional ao porte do animal, agravada na reincidência e em caso de acidente, com garantia de defesa; (v) determina a transparência dos dados de apreensões, multas e acidentes; e (vi) autoriza convênios com o Estado, o DER/PI, a ADEPI, órgãos de segurança e outros Municípios.</w:t>
+        <w:t xml:space="preserve">O projeto (i) proíbe a permanência de animais de médio e grande porte soltos em vias, logradouros e estradas municipais; (ii) estabelece os deveres do responsável; (iii) disciplina a apreensão, o registro, o bem-estar do animal, a notificação, o prazo de resgate e a destinação por leilão ou doação, vedada a eliminação sem justificativa sanitária; (iv) prevê multa proporcional ao porte do animal, com redução de 50% na primeira infração para o responsável que pagar prontamente e se comprometer a adequar suas instalações, e agravamento severo na reincidência — em triplo na primeira e em quíntuplo a partir da segunda —, em dobro em caso de acidente e com liberação do animal condicionada à vistoria das cercas do reincidente contumaz, sempre com garantia de defesa; (v) determina a transparência dos dados de apreensões, multas e acidentes; e (vi) autoriza convênios com o Estado, o DER/PI, a ADEPI, órgãos de segurança e outros Municípios.</w:t>
+      </w:r>
+    </w:p>
+    <w:p>
+      <w:pPr>
+        <w:spacing w:after="140" w:line="360"/>
+        <w:ind w:firstLine="709"/>
+        <w:jc w:val="both"/>
+      </w:pPr>
+      <w:r>
+        <w:t xml:space="preserve">A escala de sanções foi calibrada para distinguir o criador que falha uma única vez daquele que faz da via pública extensão de seu pasto. Na primeira infração, a multa de 60 UFIR para animal de grande porte (R$ 360,00 em 2026) pode ser reduzida à metade mediante pagamento rápido e compromisso de adequação. Na reincidência, o valor sobe para R$ 1.080,00 e, a partir da segunda reincidência, para R$ 1.800,00 por animal, somados à taxa de apreensão, também progressiva. O peso concentrado na reincidência preserva a proporcionalidade e a vedação ao confisco, sem retirar da norma sua força dissuasória.</w:t>
       </w:r>
     </w:p>
     <w:p>

</xml_diff>